<commit_message>
feat: complete PM module with Calendar View, Compliance filters, and execution logic
</commit_message>
<xml_diff>
--- a/Word doc for develeopment status..docx
+++ b/Word doc for develeopment status..docx
@@ -8833,7 +8833,6 @@
           <w:b/>
         </w:rPr>
       </w:pPr>
-      <w:bookmarkStart w:id="0" w:name="_GoBack"/>
       <w:r>
         <w:rPr>
           <w:b/>
@@ -9374,7 +9373,62 @@
         <w:t xml:space="preserve"> populated with full details. That should properly populated to understand for everyone for pending entries for approval remaining. </w:t>
       </w:r>
     </w:p>
-    <w:bookmarkEnd w:id="0"/>
+    <w:p>
+      <w:pPr>
+        <w:pStyle w:val="NormalWeb"/>
+        <w:rPr>
+          <w:b/>
+        </w:rPr>
+      </w:pPr>
+    </w:p>
+    <w:p>
+      <w:pPr>
+        <w:pStyle w:val="NormalWeb"/>
+        <w:rPr>
+          <w:b/>
+        </w:rPr>
+      </w:pPr>
+    </w:p>
+    <w:p>
+      <w:pPr>
+        <w:pStyle w:val="NormalWeb"/>
+        <w:numPr>
+          <w:ilvl w:val="0"/>
+          <w:numId w:val="20"/>
+        </w:numPr>
+        <w:rPr>
+          <w:b/>
+        </w:rPr>
+      </w:pPr>
+      <w:r>
+        <w:rPr>
+          <w:b/>
+        </w:rPr>
+        <w:t xml:space="preserve">Error while Plant </w:t>
+      </w:r>
+      <w:proofErr w:type="spellStart"/>
+      <w:r>
+        <w:rPr>
+          <w:b/>
+        </w:rPr>
+        <w:t>additing</w:t>
+      </w:r>
+      <w:proofErr w:type="spellEnd"/>
+      <w:r>
+        <w:rPr>
+          <w:b/>
+        </w:rPr>
+        <w:t xml:space="preserve"> on Master: </w:t>
+      </w:r>
+      <w:bookmarkStart w:id="0" w:name="_GoBack"/>
+      <w:bookmarkEnd w:id="0"/>
+      <w:r>
+        <w:rPr>
+          <w:b/>
+        </w:rPr>
+        <w:t>Failed to save. Record code or name might be duplicate.</w:t>
+      </w:r>
+    </w:p>
     <w:p>
       <w:pPr>
         <w:pStyle w:val="NormalWeb"/>
@@ -10143,6 +10197,95 @@
     </w:lvl>
   </w:abstractNum>
   <w:abstractNum w:abstractNumId="6" w15:restartNumberingAfterBreak="0">
+    <w:nsid w:val="398C7768"/>
+    <w:multiLevelType w:val="hybridMultilevel"/>
+    <w:tmpl w:val="5EE4C09C"/>
+    <w:lvl w:ilvl="0" w:tplc="0409000F">
+      <w:start w:val="1"/>
+      <w:numFmt w:val="decimal"/>
+      <w:lvlText w:val="%1."/>
+      <w:lvlJc w:val="left"/>
+      <w:pPr>
+        <w:ind w:left="720" w:hanging="360"/>
+      </w:pPr>
+      <w:rPr>
+        <w:rFonts w:hint="default"/>
+      </w:rPr>
+    </w:lvl>
+    <w:lvl w:ilvl="1" w:tplc="04090019" w:tentative="1">
+      <w:start w:val="1"/>
+      <w:numFmt w:val="lowerLetter"/>
+      <w:lvlText w:val="%2."/>
+      <w:lvlJc w:val="left"/>
+      <w:pPr>
+        <w:ind w:left="1440" w:hanging="360"/>
+      </w:pPr>
+    </w:lvl>
+    <w:lvl w:ilvl="2" w:tplc="0409001B" w:tentative="1">
+      <w:start w:val="1"/>
+      <w:numFmt w:val="lowerRoman"/>
+      <w:lvlText w:val="%3."/>
+      <w:lvlJc w:val="right"/>
+      <w:pPr>
+        <w:ind w:left="2160" w:hanging="180"/>
+      </w:pPr>
+    </w:lvl>
+    <w:lvl w:ilvl="3" w:tplc="0409000F" w:tentative="1">
+      <w:start w:val="1"/>
+      <w:numFmt w:val="decimal"/>
+      <w:lvlText w:val="%4."/>
+      <w:lvlJc w:val="left"/>
+      <w:pPr>
+        <w:ind w:left="2880" w:hanging="360"/>
+      </w:pPr>
+    </w:lvl>
+    <w:lvl w:ilvl="4" w:tplc="04090019" w:tentative="1">
+      <w:start w:val="1"/>
+      <w:numFmt w:val="lowerLetter"/>
+      <w:lvlText w:val="%5."/>
+      <w:lvlJc w:val="left"/>
+      <w:pPr>
+        <w:ind w:left="3600" w:hanging="360"/>
+      </w:pPr>
+    </w:lvl>
+    <w:lvl w:ilvl="5" w:tplc="0409001B" w:tentative="1">
+      <w:start w:val="1"/>
+      <w:numFmt w:val="lowerRoman"/>
+      <w:lvlText w:val="%6."/>
+      <w:lvlJc w:val="right"/>
+      <w:pPr>
+        <w:ind w:left="4320" w:hanging="180"/>
+      </w:pPr>
+    </w:lvl>
+    <w:lvl w:ilvl="6" w:tplc="0409000F" w:tentative="1">
+      <w:start w:val="1"/>
+      <w:numFmt w:val="decimal"/>
+      <w:lvlText w:val="%7."/>
+      <w:lvlJc w:val="left"/>
+      <w:pPr>
+        <w:ind w:left="5040" w:hanging="360"/>
+      </w:pPr>
+    </w:lvl>
+    <w:lvl w:ilvl="7" w:tplc="04090019" w:tentative="1">
+      <w:start w:val="1"/>
+      <w:numFmt w:val="lowerLetter"/>
+      <w:lvlText w:val="%8."/>
+      <w:lvlJc w:val="left"/>
+      <w:pPr>
+        <w:ind w:left="5760" w:hanging="360"/>
+      </w:pPr>
+    </w:lvl>
+    <w:lvl w:ilvl="8" w:tplc="0409001B" w:tentative="1">
+      <w:start w:val="1"/>
+      <w:numFmt w:val="lowerRoman"/>
+      <w:lvlText w:val="%9."/>
+      <w:lvlJc w:val="right"/>
+      <w:pPr>
+        <w:ind w:left="6480" w:hanging="180"/>
+      </w:pPr>
+    </w:lvl>
+  </w:abstractNum>
+  <w:abstractNum w:abstractNumId="7" w15:restartNumberingAfterBreak="0">
     <w:nsid w:val="3F2539B4"/>
     <w:multiLevelType w:val="multilevel"/>
     <w:tmpl w:val="BCAC9096"/>
@@ -10291,7 +10434,7 @@
       </w:rPr>
     </w:lvl>
   </w:abstractNum>
-  <w:abstractNum w:abstractNumId="7" w15:restartNumberingAfterBreak="0">
+  <w:abstractNum w:abstractNumId="8" w15:restartNumberingAfterBreak="0">
     <w:nsid w:val="43EC09BF"/>
     <w:multiLevelType w:val="multilevel"/>
     <w:tmpl w:val="1B62F062"/>
@@ -10440,7 +10583,7 @@
       </w:rPr>
     </w:lvl>
   </w:abstractNum>
-  <w:abstractNum w:abstractNumId="8" w15:restartNumberingAfterBreak="0">
+  <w:abstractNum w:abstractNumId="9" w15:restartNumberingAfterBreak="0">
     <w:nsid w:val="44220C42"/>
     <w:multiLevelType w:val="multilevel"/>
     <w:tmpl w:val="FA3C5778"/>
@@ -10589,7 +10732,7 @@
       </w:rPr>
     </w:lvl>
   </w:abstractNum>
-  <w:abstractNum w:abstractNumId="9" w15:restartNumberingAfterBreak="0">
+  <w:abstractNum w:abstractNumId="10" w15:restartNumberingAfterBreak="0">
     <w:nsid w:val="59446056"/>
     <w:multiLevelType w:val="multilevel"/>
     <w:tmpl w:val="0E6E1478"/>
@@ -10738,7 +10881,7 @@
       </w:rPr>
     </w:lvl>
   </w:abstractNum>
-  <w:abstractNum w:abstractNumId="10" w15:restartNumberingAfterBreak="0">
+  <w:abstractNum w:abstractNumId="11" w15:restartNumberingAfterBreak="0">
     <w:nsid w:val="5D4C01C3"/>
     <w:multiLevelType w:val="multilevel"/>
     <w:tmpl w:val="9BE2B2E4"/>
@@ -10851,7 +10994,7 @@
       </w:pPr>
     </w:lvl>
   </w:abstractNum>
-  <w:abstractNum w:abstractNumId="11" w15:restartNumberingAfterBreak="0">
+  <w:abstractNum w:abstractNumId="12" w15:restartNumberingAfterBreak="0">
     <w:nsid w:val="61984405"/>
     <w:multiLevelType w:val="multilevel"/>
     <w:tmpl w:val="6E845476"/>
@@ -11000,7 +11143,7 @@
       </w:rPr>
     </w:lvl>
   </w:abstractNum>
-  <w:abstractNum w:abstractNumId="12" w15:restartNumberingAfterBreak="0">
+  <w:abstractNum w:abstractNumId="13" w15:restartNumberingAfterBreak="0">
     <w:nsid w:val="66523597"/>
     <w:multiLevelType w:val="multilevel"/>
     <w:tmpl w:val="4B6A8EC8"/>
@@ -11149,7 +11292,7 @@
       </w:rPr>
     </w:lvl>
   </w:abstractNum>
-  <w:abstractNum w:abstractNumId="13" w15:restartNumberingAfterBreak="0">
+  <w:abstractNum w:abstractNumId="14" w15:restartNumberingAfterBreak="0">
     <w:nsid w:val="6CD2737B"/>
     <w:multiLevelType w:val="multilevel"/>
     <w:tmpl w:val="11A4348A"/>
@@ -11262,7 +11405,7 @@
       </w:pPr>
     </w:lvl>
   </w:abstractNum>
-  <w:abstractNum w:abstractNumId="14" w15:restartNumberingAfterBreak="0">
+  <w:abstractNum w:abstractNumId="15" w15:restartNumberingAfterBreak="0">
     <w:nsid w:val="755F0B33"/>
     <w:multiLevelType w:val="multilevel"/>
     <w:tmpl w:val="892CD76C"/>
@@ -11411,7 +11554,7 @@
       </w:rPr>
     </w:lvl>
   </w:abstractNum>
-  <w:abstractNum w:abstractNumId="15" w15:restartNumberingAfterBreak="0">
+  <w:abstractNum w:abstractNumId="16" w15:restartNumberingAfterBreak="0">
     <w:nsid w:val="7DFC7B64"/>
     <w:multiLevelType w:val="hybridMultilevel"/>
     <w:tmpl w:val="B7D278D2"/>
@@ -11500,7 +11643,7 @@
       </w:pPr>
     </w:lvl>
   </w:abstractNum>
-  <w:abstractNum w:abstractNumId="16" w15:restartNumberingAfterBreak="0">
+  <w:abstractNum w:abstractNumId="17" w15:restartNumberingAfterBreak="0">
     <w:nsid w:val="7E351A7D"/>
     <w:multiLevelType w:val="multilevel"/>
     <w:tmpl w:val="B73E61EE"/>
@@ -11613,7 +11756,7 @@
       </w:pPr>
     </w:lvl>
   </w:abstractNum>
-  <w:abstractNum w:abstractNumId="17" w15:restartNumberingAfterBreak="0">
+  <w:abstractNum w:abstractNumId="18" w15:restartNumberingAfterBreak="0">
     <w:nsid w:val="7E6113BD"/>
     <w:multiLevelType w:val="hybridMultilevel"/>
     <w:tmpl w:val="EE68BCB6"/>
@@ -11702,7 +11845,7 @@
       </w:pPr>
     </w:lvl>
   </w:abstractNum>
-  <w:abstractNum w:abstractNumId="18" w15:restartNumberingAfterBreak="0">
+  <w:abstractNum w:abstractNumId="19" w15:restartNumberingAfterBreak="0">
     <w:nsid w:val="7F373ED7"/>
     <w:multiLevelType w:val="hybridMultilevel"/>
     <w:tmpl w:val="ACFE196C"/>
@@ -11792,13 +11935,13 @@
     </w:lvl>
   </w:abstractNum>
   <w:num w:numId="1">
-    <w:abstractNumId w:val="10"/>
+    <w:abstractNumId w:val="11"/>
   </w:num>
   <w:num w:numId="2">
     <w:abstractNumId w:val="5"/>
   </w:num>
   <w:num w:numId="3">
-    <w:abstractNumId w:val="17"/>
+    <w:abstractNumId w:val="18"/>
   </w:num>
   <w:num w:numId="4">
     <w:abstractNumId w:val="1"/>
@@ -11810,43 +11953,46 @@
     <w:abstractNumId w:val="4"/>
   </w:num>
   <w:num w:numId="7">
-    <w:abstractNumId w:val="13"/>
+    <w:abstractNumId w:val="14"/>
   </w:num>
   <w:num w:numId="8">
-    <w:abstractNumId w:val="11"/>
+    <w:abstractNumId w:val="12"/>
   </w:num>
   <w:num w:numId="9">
-    <w:abstractNumId w:val="7"/>
+    <w:abstractNumId w:val="8"/>
   </w:num>
   <w:num w:numId="10">
-    <w:abstractNumId w:val="6"/>
+    <w:abstractNumId w:val="7"/>
   </w:num>
   <w:num w:numId="11">
     <w:abstractNumId w:val="2"/>
   </w:num>
   <w:num w:numId="12">
+    <w:abstractNumId w:val="10"/>
+  </w:num>
+  <w:num w:numId="13">
     <w:abstractNumId w:val="9"/>
   </w:num>
-  <w:num w:numId="13">
-    <w:abstractNumId w:val="8"/>
-  </w:num>
   <w:num w:numId="14">
-    <w:abstractNumId w:val="14"/>
+    <w:abstractNumId w:val="15"/>
   </w:num>
   <w:num w:numId="15">
-    <w:abstractNumId w:val="12"/>
+    <w:abstractNumId w:val="13"/>
   </w:num>
   <w:num w:numId="16">
-    <w:abstractNumId w:val="16"/>
+    <w:abstractNumId w:val="17"/>
   </w:num>
   <w:num w:numId="17">
     <w:abstractNumId w:val="0"/>
   </w:num>
   <w:num w:numId="18">
-    <w:abstractNumId w:val="18"/>
+    <w:abstractNumId w:val="19"/>
   </w:num>
   <w:num w:numId="19">
-    <w:abstractNumId w:val="15"/>
+    <w:abstractNumId w:val="16"/>
+  </w:num>
+  <w:num w:numId="20">
+    <w:abstractNumId w:val="6"/>
   </w:num>
 </w:numbering>
 </file>

</xml_diff>

<commit_message>
feat(cmms): update mobile screens, backend controllers, scheduler service, and reports page
- Implement theme, menu, and PM completion screen in mobile app

- Redesign breakdown and dashboard screens in mobile app

- Update BreakdownController, UserController, pm.controller, and SchedulerService in backend

- Update Reports, PMCalendar, and Register pages in frontend

- Update project docs and sync plan
</commit_message>
<xml_diff>
--- a/Word doc for develeopment status..docx
+++ b/Word doc for develeopment status..docx
@@ -9420,14 +9420,918 @@
         </w:rPr>
         <w:t xml:space="preserve"> on Master: </w:t>
       </w:r>
+      <w:r>
+        <w:rPr>
+          <w:b/>
+        </w:rPr>
+        <w:t>Failed to save. Record code or name might be duplicate.</w:t>
+      </w:r>
+    </w:p>
+    <w:p>
+      <w:pPr>
+        <w:pStyle w:val="NormalWeb"/>
+        <w:numPr>
+          <w:ilvl w:val="0"/>
+          <w:numId w:val="20"/>
+        </w:numPr>
+        <w:rPr>
+          <w:b/>
+        </w:rPr>
+      </w:pPr>
+      <w:r>
+        <w:rPr>
+          <w:b/>
+        </w:rPr>
+        <w:t xml:space="preserve">Current Development is going on for Plant: Pune, correct it. </w:t>
+      </w:r>
+    </w:p>
+    <w:p>
+      <w:pPr>
+        <w:pStyle w:val="NormalWeb"/>
+        <w:numPr>
+          <w:ilvl w:val="0"/>
+          <w:numId w:val="20"/>
+        </w:numPr>
+        <w:rPr>
+          <w:b/>
+        </w:rPr>
+      </w:pPr>
+      <w:r>
+        <w:rPr>
+          <w:b/>
+        </w:rPr>
+        <w:t xml:space="preserve">Department Master: 4 machine </w:t>
+      </w:r>
+      <w:proofErr w:type="spellStart"/>
+      <w:r>
+        <w:rPr>
+          <w:b/>
+        </w:rPr>
+        <w:t>repeted</w:t>
+      </w:r>
+      <w:proofErr w:type="spellEnd"/>
+      <w:r>
+        <w:rPr>
+          <w:b/>
+        </w:rPr>
+        <w:t xml:space="preserve"> 2 times. This may conflict</w:t>
+      </w:r>
+    </w:p>
+    <w:p>
+      <w:pPr>
+        <w:pStyle w:val="NormalWeb"/>
+        <w:numPr>
+          <w:ilvl w:val="0"/>
+          <w:numId w:val="20"/>
+        </w:numPr>
+        <w:rPr>
+          <w:b/>
+        </w:rPr>
+      </w:pPr>
+      <w:r>
+        <w:rPr>
+          <w:b/>
+        </w:rPr>
+        <w:t xml:space="preserve">Machine master: for all Machine Name – </w:t>
+      </w:r>
+      <w:proofErr w:type="spellStart"/>
+      <w:r>
+        <w:rPr>
+          <w:b/>
+        </w:rPr>
+        <w:t>Deapartment</w:t>
+      </w:r>
+      <w:proofErr w:type="spellEnd"/>
+      <w:r>
+        <w:rPr>
+          <w:b/>
+        </w:rPr>
+        <w:t>/Unit not showing</w:t>
+      </w:r>
+    </w:p>
+    <w:p>
+      <w:pPr>
+        <w:pStyle w:val="NormalWeb"/>
+        <w:numPr>
+          <w:ilvl w:val="0"/>
+          <w:numId w:val="20"/>
+        </w:numPr>
+        <w:rPr>
+          <w:b/>
+        </w:rPr>
+      </w:pPr>
+      <w:r>
+        <w:rPr>
+          <w:b/>
+        </w:rPr>
+        <w:t xml:space="preserve">Plant ID/Department ID/Machine ID/Unit ID- like his ID are very big and does not required to show on Dashboard screen. Why that ID is very big and </w:t>
+      </w:r>
+      <w:proofErr w:type="spellStart"/>
+      <w:r>
+        <w:rPr>
+          <w:b/>
+        </w:rPr>
+        <w:t>randamaly</w:t>
+      </w:r>
+      <w:proofErr w:type="spellEnd"/>
+      <w:r>
+        <w:rPr>
+          <w:b/>
+        </w:rPr>
+        <w:t xml:space="preserve"> created? Can we create it like (Plant/Department/Machine/Number) (PU-PRIN-KBA1)? That will be easy to understand.</w:t>
+      </w:r>
+    </w:p>
+    <w:p>
+      <w:pPr>
+        <w:pStyle w:val="NormalWeb"/>
+        <w:numPr>
+          <w:ilvl w:val="0"/>
+          <w:numId w:val="20"/>
+        </w:numPr>
+        <w:rPr>
+          <w:b/>
+        </w:rPr>
+      </w:pPr>
+      <w:r>
+        <w:rPr>
+          <w:b/>
+        </w:rPr>
+        <w:t xml:space="preserve">Still not working in </w:t>
+      </w:r>
+      <w:r>
+        <w:rPr>
+          <w:b/>
+        </w:rPr>
+        <w:t xml:space="preserve">Preventive </w:t>
+      </w:r>
+      <w:proofErr w:type="gramStart"/>
+      <w:r>
+        <w:rPr>
+          <w:b/>
+        </w:rPr>
+        <w:t>Maintenance :</w:t>
+      </w:r>
+      <w:proofErr w:type="gramEnd"/>
+      <w:r>
+        <w:rPr>
+          <w:b/>
+        </w:rPr>
+        <w:t xml:space="preserve"> Task Master: Add task window does not have field of machine name, Unit to add their details. Only Machine Category available which is insufficient to add task for particular unit wise and machine wise.</w:t>
+      </w:r>
+      <w:r>
+        <w:rPr>
+          <w:b/>
+        </w:rPr>
+        <w:t xml:space="preserve">  Now Add schedule button not working. </w:t>
+      </w:r>
+    </w:p>
+    <w:p>
+      <w:pPr>
+        <w:pStyle w:val="NormalWeb"/>
+        <w:rPr>
+          <w:b/>
+        </w:rPr>
+      </w:pPr>
+    </w:p>
+    <w:p>
+      <w:pPr>
+        <w:pStyle w:val="NormalWeb"/>
+        <w:rPr>
+          <w:b/>
+        </w:rPr>
+      </w:pPr>
+    </w:p>
+    <w:p>
+      <w:pPr>
+        <w:pStyle w:val="NormalWeb"/>
+        <w:rPr>
+          <w:b/>
+        </w:rPr>
+      </w:pPr>
+    </w:p>
+    <w:p>
+      <w:pPr>
+        <w:pStyle w:val="NormalWeb"/>
+        <w:rPr>
+          <w:b/>
+        </w:rPr>
+      </w:pPr>
+    </w:p>
+    <w:p>
+      <w:pPr>
+        <w:pStyle w:val="NormalWeb"/>
+        <w:rPr>
+          <w:b/>
+        </w:rPr>
+      </w:pPr>
+    </w:p>
+    <w:p>
+      <w:pPr>
+        <w:pStyle w:val="NormalWeb"/>
+        <w:rPr>
+          <w:b/>
+        </w:rPr>
+      </w:pPr>
+    </w:p>
+    <w:p>
+      <w:pPr>
+        <w:pStyle w:val="NormalWeb"/>
+        <w:rPr>
+          <w:b/>
+        </w:rPr>
+      </w:pPr>
+      <w:r>
+        <w:rPr>
+          <w:b/>
+        </w:rPr>
+        <w:lastRenderedPageBreak/>
+        <w:t># Goal: Complete Mobile Application Overhaul</w:t>
+      </w:r>
+    </w:p>
+    <w:p>
+      <w:pPr>
+        <w:pStyle w:val="NormalWeb"/>
+        <w:rPr>
+          <w:b/>
+        </w:rPr>
+      </w:pPr>
+    </w:p>
+    <w:p>
+      <w:pPr>
+        <w:pStyle w:val="NormalWeb"/>
+        <w:rPr>
+          <w:b/>
+        </w:rPr>
+      </w:pPr>
+      <w:r>
+        <w:rPr>
+          <w:b/>
+        </w:rPr>
+        <w:t>We will transform the current basic mobile application into a highly attractive, premium, full-featured CMMS mobile app that perfectly mirrors the capabilities of the web application.</w:t>
+      </w:r>
+    </w:p>
+    <w:p>
+      <w:pPr>
+        <w:pStyle w:val="NormalWeb"/>
+        <w:rPr>
+          <w:b/>
+        </w:rPr>
+      </w:pPr>
+    </w:p>
+    <w:p>
+      <w:pPr>
+        <w:pStyle w:val="NormalWeb"/>
+        <w:rPr>
+          <w:b/>
+        </w:rPr>
+      </w:pPr>
+      <w:r>
+        <w:rPr>
+          <w:b/>
+        </w:rPr>
+        <w:t>Because this is a massive undertaking touching every part of the mobile app, we must execute it in **Phases** to ensure stability, maintain ultra-high quality, and be token/credit efficient.</w:t>
+      </w:r>
+    </w:p>
+    <w:p>
+      <w:pPr>
+        <w:pStyle w:val="NormalWeb"/>
+        <w:rPr>
+          <w:b/>
+        </w:rPr>
+      </w:pPr>
+    </w:p>
+    <w:p>
+      <w:pPr>
+        <w:pStyle w:val="NormalWeb"/>
+        <w:rPr>
+          <w:b/>
+        </w:rPr>
+      </w:pPr>
+      <w:r>
+        <w:rPr>
+          <w:b/>
+        </w:rPr>
+        <w:t>## Phase 1: Foundation &amp; Premium Dashboard (Current Focus)</w:t>
+      </w:r>
+    </w:p>
+    <w:p>
+      <w:pPr>
+        <w:pStyle w:val="NormalWeb"/>
+        <w:rPr>
+          <w:b/>
+        </w:rPr>
+      </w:pPr>
+      <w:r>
+        <w:rPr>
+          <w:b/>
+        </w:rPr>
+        <w:t>1. **Design System &amp; Navigation</w:t>
+      </w:r>
+      <w:proofErr w:type="gramStart"/>
+      <w:r>
+        <w:rPr>
+          <w:b/>
+        </w:rPr>
+        <w:t>:*</w:t>
+      </w:r>
+      <w:proofErr w:type="gramEnd"/>
+      <w:r>
+        <w:rPr>
+          <w:b/>
+        </w:rPr>
+        <w:t>*</w:t>
+      </w:r>
+    </w:p>
+    <w:p>
+      <w:pPr>
+        <w:pStyle w:val="NormalWeb"/>
+        <w:rPr>
+          <w:b/>
+        </w:rPr>
+      </w:pPr>
+      <w:r>
+        <w:rPr>
+          <w:b/>
+        </w:rPr>
+        <w:t xml:space="preserve">   - Overhaul the current basic Stack Navigator. We will introduce a premium **Bottom Tab Navigator** for easy access to core modules (Dashboard, Logs, PM, Menu).</w:t>
+      </w:r>
+    </w:p>
+    <w:p>
+      <w:pPr>
+        <w:pStyle w:val="NormalWeb"/>
+        <w:rPr>
+          <w:b/>
+        </w:rPr>
+      </w:pPr>
+      <w:r>
+        <w:rPr>
+          <w:b/>
+        </w:rPr>
+        <w:t xml:space="preserve">   - Implement a dark-mode, </w:t>
+      </w:r>
+      <w:proofErr w:type="spellStart"/>
+      <w:r>
+        <w:rPr>
+          <w:b/>
+        </w:rPr>
+        <w:t>glassmorphism</w:t>
+      </w:r>
+      <w:proofErr w:type="spellEnd"/>
+      <w:r>
+        <w:rPr>
+          <w:b/>
+        </w:rPr>
+        <w:t>-inspired premium theme to match the web app's high aesthetic standards.</w:t>
+      </w:r>
+    </w:p>
+    <w:p>
+      <w:pPr>
+        <w:pStyle w:val="NormalWeb"/>
+        <w:rPr>
+          <w:b/>
+        </w:rPr>
+      </w:pPr>
+      <w:r>
+        <w:rPr>
+          <w:b/>
+        </w:rPr>
+        <w:t>2. **Dashboard Screen Overhaul</w:t>
+      </w:r>
+      <w:proofErr w:type="gramStart"/>
+      <w:r>
+        <w:rPr>
+          <w:b/>
+        </w:rPr>
+        <w:t>:*</w:t>
+      </w:r>
+      <w:proofErr w:type="gramEnd"/>
+      <w:r>
+        <w:rPr>
+          <w:b/>
+        </w:rPr>
+        <w:t>*</w:t>
+      </w:r>
+    </w:p>
+    <w:p>
+      <w:pPr>
+        <w:pStyle w:val="NormalWeb"/>
+        <w:rPr>
+          <w:b/>
+        </w:rPr>
+      </w:pPr>
+      <w:r>
+        <w:rPr>
+          <w:b/>
+        </w:rPr>
+        <w:t xml:space="preserve">   - Implement the Top KPI Cards (Total Logs, Pending, Completed, MTTR, etc.).</w:t>
+      </w:r>
+    </w:p>
+    <w:p>
+      <w:pPr>
+        <w:pStyle w:val="NormalWeb"/>
+        <w:rPr>
+          <w:b/>
+        </w:rPr>
+      </w:pPr>
+      <w:r>
+        <w:rPr>
+          <w:b/>
+        </w:rPr>
+        <w:t xml:space="preserve">   - Integrate Chart.js / React Native SVG Charts to render beautiful visual analytics directly on the mobile dashboard.</w:t>
+      </w:r>
+    </w:p>
+    <w:p>
+      <w:pPr>
+        <w:pStyle w:val="NormalWeb"/>
+        <w:rPr>
+          <w:b/>
+        </w:rPr>
+      </w:pPr>
+      <w:r>
+        <w:rPr>
+          <w:b/>
+        </w:rPr>
+        <w:t xml:space="preserve">   - Add the "Last 50 Entries" and "Highest Breakdown (Top 50)" lists to the dashboard.</w:t>
+      </w:r>
+    </w:p>
+    <w:p>
+      <w:pPr>
+        <w:pStyle w:val="NormalWeb"/>
+        <w:rPr>
+          <w:b/>
+        </w:rPr>
+      </w:pPr>
+    </w:p>
+    <w:p>
+      <w:pPr>
+        <w:pStyle w:val="NormalWeb"/>
+        <w:rPr>
+          <w:b/>
+        </w:rPr>
+      </w:pPr>
+      <w:r>
+        <w:rPr>
+          <w:b/>
+        </w:rPr>
+        <w:t>## Phase 2: Core Workflows (Future)</w:t>
+      </w:r>
+    </w:p>
+    <w:p>
+      <w:pPr>
+        <w:pStyle w:val="NormalWeb"/>
+        <w:rPr>
+          <w:b/>
+        </w:rPr>
+      </w:pPr>
+      <w:r>
+        <w:rPr>
+          <w:b/>
+        </w:rPr>
+        <w:t>- **Breakdown Entry &amp; Admin Review</w:t>
+      </w:r>
+      <w:proofErr w:type="gramStart"/>
+      <w:r>
+        <w:rPr>
+          <w:b/>
+        </w:rPr>
+        <w:t>:*</w:t>
+      </w:r>
+      <w:proofErr w:type="gramEnd"/>
+      <w:r>
+        <w:rPr>
+          <w:b/>
+        </w:rPr>
+        <w:t>* Complete styling overhaul of the reporting form and the Admin Approval queue.</w:t>
+      </w:r>
+    </w:p>
+    <w:p>
+      <w:pPr>
+        <w:pStyle w:val="NormalWeb"/>
+        <w:rPr>
+          <w:b/>
+        </w:rPr>
+      </w:pPr>
+      <w:r>
+        <w:rPr>
+          <w:b/>
+        </w:rPr>
+        <w:t>- **Preventive Maintenance</w:t>
+      </w:r>
+      <w:proofErr w:type="gramStart"/>
+      <w:r>
+        <w:rPr>
+          <w:b/>
+        </w:rPr>
+        <w:t>:*</w:t>
+      </w:r>
+      <w:proofErr w:type="gramEnd"/>
+      <w:r>
+        <w:rPr>
+          <w:b/>
+        </w:rPr>
+        <w:t>* Replicate the Calendar, Active Schedules, and Execution flows with the new UI.</w:t>
+      </w:r>
+    </w:p>
+    <w:p>
+      <w:pPr>
+        <w:pStyle w:val="NormalWeb"/>
+        <w:rPr>
+          <w:b/>
+        </w:rPr>
+      </w:pPr>
+    </w:p>
+    <w:p>
+      <w:pPr>
+        <w:pStyle w:val="NormalWeb"/>
+        <w:rPr>
+          <w:b/>
+        </w:rPr>
+      </w:pPr>
+      <w:r>
+        <w:rPr>
+          <w:b/>
+        </w:rPr>
+        <w:lastRenderedPageBreak/>
+        <w:t>## Phase 3: Reporting &amp; Administration (Future)</w:t>
+      </w:r>
+    </w:p>
+    <w:p>
+      <w:pPr>
+        <w:pStyle w:val="NormalWeb"/>
+        <w:rPr>
+          <w:b/>
+        </w:rPr>
+      </w:pPr>
+      <w:r>
+        <w:rPr>
+          <w:b/>
+        </w:rPr>
+        <w:t>- **Reports Module</w:t>
+      </w:r>
+      <w:proofErr w:type="gramStart"/>
+      <w:r>
+        <w:rPr>
+          <w:b/>
+        </w:rPr>
+        <w:t>:*</w:t>
+      </w:r>
+      <w:proofErr w:type="gramEnd"/>
+      <w:r>
+        <w:rPr>
+          <w:b/>
+        </w:rPr>
+        <w:t>* Implement the dedicated MTTR/MTBF analytics screens with Department, Machine, and Month filters.</w:t>
+      </w:r>
+    </w:p>
+    <w:p>
+      <w:pPr>
+        <w:pStyle w:val="NormalWeb"/>
+        <w:rPr>
+          <w:b/>
+        </w:rPr>
+      </w:pPr>
+      <w:r>
+        <w:rPr>
+          <w:b/>
+        </w:rPr>
+        <w:t>- **User Management</w:t>
+      </w:r>
+      <w:proofErr w:type="gramStart"/>
+      <w:r>
+        <w:rPr>
+          <w:b/>
+        </w:rPr>
+        <w:t>:*</w:t>
+      </w:r>
+      <w:proofErr w:type="gramEnd"/>
+      <w:r>
+        <w:rPr>
+          <w:b/>
+        </w:rPr>
+        <w:t>* Full user management UI.</w:t>
+      </w:r>
+    </w:p>
+    <w:p>
+      <w:pPr>
+        <w:pStyle w:val="NormalWeb"/>
+        <w:rPr>
+          <w:b/>
+        </w:rPr>
+      </w:pPr>
+    </w:p>
+    <w:p>
+      <w:pPr>
+        <w:pStyle w:val="NormalWeb"/>
+        <w:rPr>
+          <w:b/>
+        </w:rPr>
+      </w:pPr>
+      <w:r>
+        <w:rPr>
+          <w:b/>
+        </w:rPr>
+        <w:t>## Proposed Changes (For Phase 1)</w:t>
+      </w:r>
+    </w:p>
+    <w:p>
+      <w:pPr>
+        <w:pStyle w:val="NormalWeb"/>
+        <w:rPr>
+          <w:b/>
+        </w:rPr>
+      </w:pPr>
+    </w:p>
+    <w:p>
+      <w:pPr>
+        <w:pStyle w:val="NormalWeb"/>
+        <w:rPr>
+          <w:b/>
+        </w:rPr>
+      </w:pPr>
+      <w:r>
+        <w:rPr>
+          <w:b/>
+        </w:rPr>
+        <w:t>### [MODIFY] `mobile/</w:t>
+      </w:r>
+      <w:proofErr w:type="spellStart"/>
+      <w:r>
+        <w:rPr>
+          <w:b/>
+        </w:rPr>
+        <w:t>App.tsx</w:t>
+      </w:r>
+      <w:proofErr w:type="spellEnd"/>
+      <w:r>
+        <w:rPr>
+          <w:b/>
+        </w:rPr>
+        <w:t>` &amp; `mobile/</w:t>
+      </w:r>
+      <w:proofErr w:type="spellStart"/>
+      <w:r>
+        <w:rPr>
+          <w:b/>
+        </w:rPr>
+        <w:t>package.json</w:t>
+      </w:r>
+      <w:proofErr w:type="spellEnd"/>
+      <w:r>
+        <w:rPr>
+          <w:b/>
+        </w:rPr>
+        <w:t>`</w:t>
+      </w:r>
+    </w:p>
+    <w:p>
+      <w:pPr>
+        <w:pStyle w:val="NormalWeb"/>
+        <w:rPr>
+          <w:b/>
+        </w:rPr>
+      </w:pPr>
+      <w:r>
+        <w:rPr>
+          <w:b/>
+        </w:rPr>
+        <w:t>- Install `@react-navigation/bottom-tabs`.</w:t>
+      </w:r>
+    </w:p>
+    <w:p>
+      <w:pPr>
+        <w:pStyle w:val="NormalWeb"/>
+        <w:rPr>
+          <w:b/>
+        </w:rPr>
+      </w:pPr>
+      <w:r>
+        <w:rPr>
+          <w:b/>
+        </w:rPr>
+        <w:t>- Reconfigure the navigation structure to use a modern Bottom Tab layout.</w:t>
+      </w:r>
+    </w:p>
+    <w:p>
+      <w:pPr>
+        <w:pStyle w:val="NormalWeb"/>
+        <w:rPr>
+          <w:b/>
+        </w:rPr>
+      </w:pPr>
+    </w:p>
+    <w:p>
+      <w:pPr>
+        <w:pStyle w:val="NormalWeb"/>
+        <w:rPr>
+          <w:b/>
+        </w:rPr>
+      </w:pPr>
+      <w:r>
+        <w:rPr>
+          <w:b/>
+        </w:rPr>
+        <w:t>### [MODIFY] `mobile/</w:t>
+      </w:r>
+      <w:proofErr w:type="spellStart"/>
+      <w:r>
+        <w:rPr>
+          <w:b/>
+        </w:rPr>
+        <w:t>src</w:t>
+      </w:r>
+      <w:proofErr w:type="spellEnd"/>
+      <w:r>
+        <w:rPr>
+          <w:b/>
+        </w:rPr>
+        <w:t>/components/</w:t>
+      </w:r>
+      <w:proofErr w:type="spellStart"/>
+      <w:r>
+        <w:rPr>
+          <w:b/>
+        </w:rPr>
+        <w:t>Theme.ts</w:t>
+      </w:r>
+      <w:proofErr w:type="spellEnd"/>
+      <w:r>
+        <w:rPr>
+          <w:b/>
+        </w:rPr>
+        <w:t>`</w:t>
+      </w:r>
+    </w:p>
+    <w:p>
+      <w:pPr>
+        <w:pStyle w:val="NormalWeb"/>
+        <w:rPr>
+          <w:b/>
+        </w:rPr>
+      </w:pPr>
+      <w:r>
+        <w:rPr>
+          <w:b/>
+        </w:rPr>
+        <w:t>- Upgrade color palettes, typography guidelines, and styling presets to look extremely premium and modern.</w:t>
+      </w:r>
+    </w:p>
+    <w:p>
+      <w:pPr>
+        <w:pStyle w:val="NormalWeb"/>
+        <w:rPr>
+          <w:b/>
+        </w:rPr>
+      </w:pPr>
+    </w:p>
+    <w:p>
+      <w:pPr>
+        <w:pStyle w:val="NormalWeb"/>
+        <w:rPr>
+          <w:b/>
+        </w:rPr>
+      </w:pPr>
+      <w:r>
+        <w:rPr>
+          <w:b/>
+        </w:rPr>
+        <w:t>### [MODIFY] `mobile/</w:t>
+      </w:r>
+      <w:proofErr w:type="spellStart"/>
+      <w:r>
+        <w:rPr>
+          <w:b/>
+        </w:rPr>
+        <w:t>src</w:t>
+      </w:r>
+      <w:proofErr w:type="spellEnd"/>
+      <w:r>
+        <w:rPr>
+          <w:b/>
+        </w:rPr>
+        <w:t>/screens/</w:t>
+      </w:r>
+      <w:proofErr w:type="spellStart"/>
+      <w:r>
+        <w:rPr>
+          <w:b/>
+        </w:rPr>
+        <w:t>DashboardScreen.tsx</w:t>
+      </w:r>
+      <w:proofErr w:type="spellEnd"/>
+      <w:r>
+        <w:rPr>
+          <w:b/>
+        </w:rPr>
+        <w:t>`</w:t>
+      </w:r>
+    </w:p>
+    <w:p>
+      <w:pPr>
+        <w:pStyle w:val="NormalWeb"/>
+        <w:rPr>
+          <w:b/>
+        </w:rPr>
+      </w:pPr>
+      <w:r>
+        <w:rPr>
+          <w:b/>
+        </w:rPr>
+        <w:t>- Complete rewrite.</w:t>
+      </w:r>
+    </w:p>
+    <w:p>
+      <w:pPr>
+        <w:pStyle w:val="NormalWeb"/>
+        <w:rPr>
+          <w:b/>
+        </w:rPr>
+      </w:pPr>
+      <w:r>
+        <w:rPr>
+          <w:b/>
+        </w:rPr>
+        <w:t>- Fetch global metrics, top 50 / last 50 logs.</w:t>
+      </w:r>
+    </w:p>
+    <w:p>
+      <w:pPr>
+        <w:pStyle w:val="NormalWeb"/>
+        <w:rPr>
+          <w:b/>
+        </w:rPr>
+      </w:pPr>
+      <w:r>
+        <w:rPr>
+          <w:b/>
+        </w:rPr>
+        <w:t>- Implement scrollable, beautiful card layouts and charts.</w:t>
+      </w:r>
+    </w:p>
+    <w:p>
+      <w:pPr>
+        <w:pStyle w:val="NormalWeb"/>
+        <w:rPr>
+          <w:b/>
+        </w:rPr>
+      </w:pPr>
+    </w:p>
+    <w:p>
+      <w:pPr>
+        <w:pStyle w:val="NormalWeb"/>
+        <w:rPr>
+          <w:b/>
+        </w:rPr>
+      </w:pPr>
+      <w:r>
+        <w:rPr>
+          <w:b/>
+        </w:rPr>
+        <w:t>## Open Questions</w:t>
+      </w:r>
+    </w:p>
+    <w:p>
+      <w:pPr>
+        <w:pStyle w:val="NormalWeb"/>
+        <w:rPr>
+          <w:b/>
+        </w:rPr>
+      </w:pPr>
+      <w:r>
+        <w:rPr>
+          <w:b/>
+        </w:rPr>
+        <w:t>- Do you approve of executing this massive upgrade in these smaller, highly-focused Phases (starting with the Foundation &amp; Dashboard)? This is the safest and most efficient way to build a premium mobile app.</w:t>
+      </w:r>
+    </w:p>
+    <w:p>
+      <w:pPr>
+        <w:pStyle w:val="NormalWeb"/>
+        <w:rPr>
+          <w:b/>
+        </w:rPr>
+      </w:pPr>
+      <w:r>
+        <w:rPr>
+          <w:b/>
+        </w:rPr>
+        <w:t>- For the mobile charts, I will use `react-native-chart-kit` or similar. Are you okay with me adding this dependency to `mobile/</w:t>
+      </w:r>
+      <w:proofErr w:type="spellStart"/>
+      <w:r>
+        <w:rPr>
+          <w:b/>
+        </w:rPr>
+        <w:t>package.json</w:t>
+      </w:r>
+      <w:proofErr w:type="spellEnd"/>
+      <w:r>
+        <w:rPr>
+          <w:b/>
+        </w:rPr>
+        <w:t>`?</w:t>
+      </w:r>
       <w:bookmarkStart w:id="0" w:name="_GoBack"/>
       <w:bookmarkEnd w:id="0"/>
-      <w:r>
-        <w:rPr>
-          <w:b/>
-        </w:rPr>
-        <w:t>Failed to save. Record code or name might be duplicate.</w:t>
-      </w:r>
     </w:p>
     <w:p>
       <w:pPr>

</xml_diff>